<commit_message>
Design v0.1: add non-swipe report logic, terminal API, wording fixes
Co-Authored-By: Claude Opus 5.5 <noreply@anthropic.com>
Claude-Session: https://claude.ai/code/session_01ELykhL4J6brbFizhwn5ZfX
</commit_message>
<xml_diff>
--- a/docs/CR-YYYY-XXX/CR-YYYY-XXX_Design_v0.1.docx
+++ b/docs/CR-YYYY-XXX/CR-YYYY-XXX_Design_v0.1.docx
@@ -20608,7 +20608,7 @@
               <w:rPr>
                 <w:sz w:val="18"/>
               </w:rPr>
-              <w:t>REG_NONSWIPE (IR); P780_PERIOD; excludes exempted days</w:t>
+              <w:t>REG_NONSWIPE (IR); P780_PERIOD, P780_MIN_TRIPS; excludes exempted days</w:t>
             </w:r>
           </w:p>
         </w:tc>
@@ -20626,7 +20626,7 @@
               <w:rPr>
                 <w:sz w:val="18"/>
               </w:rPr>
-              <w:t>F_IS_PRESENT, exemptions (DS-14)</w:t>
+              <w:t>F_NONSWIPE_REPORT (DS-14)</w:t>
             </w:r>
           </w:p>
         </w:tc>
@@ -20758,17 +20758,7 @@
         <w:t>F_GET_CURRENT_EMPLOYEE</w:t>
       </w:r>
       <w:r>
-        <w:t xml:space="preserve">), never from a page item. This closes the tampering risk seen with </w:t>
-      </w:r>
-      <w:r>
-        <w:rPr>
-          <w:rFonts w:ascii="Consolas" w:hAnsi="Consolas"/>
-          <w:sz w:val="18"/>
-        </w:rPr>
-        <w:t>P20_EMP_ID</w:t>
-      </w:r>
-      <w:r>
-        <w:t xml:space="preserve"> in the demo schema.</w:t>
+        <w:t>), never from a page item, so one employee can't act as another by changing a value in the browser.</w:t>
       </w:r>
     </w:p>
     <w:p>
@@ -25319,7 +25309,7 @@
         <w:t>Data safety:</w:t>
       </w:r>
       <w:r>
-        <w:t xml:space="preserve"> step 6 destroys all transport data. Before go-live that is fine. After go-live, stop at step 1–3 (disable jobs, block the endpoint, hide the pages) and keep the data for payroll audit.</w:t>
+        <w:t xml:space="preserve"> step 6 destroys all transport data. Before go-live that is fine. After go-live, do only steps 1–3 (disable jobs, block the endpoint, hide the pages) and keep the data for payroll audit.</w:t>
       </w:r>
     </w:p>
     <w:p>
@@ -25383,7 +25373,7 @@
         <w:t>Concurrency:</w:t>
       </w:r>
       <w:r>
-        <w:t xml:space="preserve"> two approvers deciding the same request (one gets -20709); the job running while Finance closes the period (close runs derivation first, and the job skips CLOSED periods).</w:t>
+        <w:t xml:space="preserve"> two approvers deciding the same request (one gets -20709); the job running while Finance closes the period (close runs derivation first; trips dated in a closed period go to the next open period, §6.2 step 7).</w:t>
       </w:r>
     </w:p>
     <w:p>
@@ -25561,7 +25551,7 @@
               <w:rPr>
                 <w:sz w:val="18"/>
               </w:rPr>
-              <w:t>Defaults in §14.3 are the MoM's literal reading; Finance reviews the settings before activation</w:t>
+              <w:t>Defaults in §14.3 are the closest reading of the MoM; Finance reviews every setting before activation</w:t>
             </w:r>
           </w:p>
         </w:tc>

</xml_diff>